<commit_message>
Tema 1 ders dosyalarindaki tum gorseller baski boyutunda yeniden cizildi (duzenekler, bos grafik kaliplari, korozyon gorselleri)
</commit_message>
<xml_diff>
--- a/Kim12-1-4-Standart-Hucre-Potansiyeli.docx
+++ b/Kim12-1-4-Standart-Hucre-Potansiyeli.docx
@@ -545,7 +545,7 @@
       <w:r>
         <w:drawing>
           <wp:inline distT="0" distB="0" distL="0" distR="0">
-            <wp:extent cx="3240000" cy="3505454"/>
+            <wp:extent cx="3124206" cy="3752095"/>
             <wp:docPr id="900002" name="Grafik 900002" descr="Standart hidrojen elektrodu"/>
             <wp:cNvGraphicFramePr>
               <a:graphicFrameLocks noChangeAspect="1"/>
@@ -566,7 +566,7 @@
                   <pic:spPr>
                     <a:xfrm>
                       <a:off x="0" y="0"/>
-                      <a:ext cx="3240000" cy="3505454"/>
+                      <a:ext cx="3124206" cy="3752095"/>
                     </a:xfrm>
                     <a:prstGeom prst="rect">
                       <a:avLst/>

</xml_diff>

<commit_message>
Kim12-1-4-Standart-Hucre-Potansiyeli: gorsel alanlarina Shutter onizlemeleri yerlestirildi (2.3 bicimi)
</commit_message>
<xml_diff>
--- a/Kim12-1-4-Standart-Hucre-Potansiyeli.docx
+++ b/Kim12-1-4-Standart-Hucre-Potansiyeli.docx
@@ -39,85 +39,59 @@
         <w:t xml:space="preserve">2019 yılında Nobel Kimya Ödülü, lityum iyon pillerin geliştirilmesine katkıda bulunan John B. Goodenough, M. Stanley Whittingham ve Akira Yoshino’ya verildi. Hafif, şarj edilebilir ve yüksek enerji depolayabilen bu piller sayesinde cep telefonları ve dizüstü bilgisayarlar cebe sığacak kadar küçüldü, elektrikli araçlar yaygınlaşmaya başladı (Görsel A). Sizce lityum iyon pil çalışmalarının Nobel Ödülü’ne layık görülmesi ile elektronik endüstrisinin bugünkü gelişimi arasında nasıl bir bağ kurulabilir? Kumandada kullandığınız alkalin pilin üzerinde 1,5 V, telefonunuzun bataryasında ise 3,7 V gibi bir değer yazdığını fark etmiş olabilirsiniz. Peki bir pilin gerilimi neye bağlıdır? Kurulmadan önce bir galvanik hücrenin kaç volt üreteceğini hesaplamak mümkün müdür? Bu soruların cevabını bir etkinlik yaparak keşfediniz.</w:t>
       </w:r>
     </w:p>
-    <w:tbl>
-      <w:tblPr>
-        <w:tblW w:w="9000" w:type="dxa"/>
+    <w:p>
+      <w:pPr>
         <w:jc w:val="center"/>
-        <w:tblBorders>
-          <w:top w:val="single" w:sz="8" w:space="0" w:color="7F7F7F"/>
-          <w:left w:val="single" w:sz="8" w:space="0" w:color="7F7F7F"/>
-          <w:bottom w:val="single" w:sz="8" w:space="0" w:color="7F7F7F"/>
-          <w:right w:val="single" w:sz="8" w:space="0" w:color="7F7F7F"/>
-        </w:tblBorders>
-      </w:tblPr>
-      <w:tblGrid>
-        <w:gridCol w:w="9000"/>
-      </w:tblGrid>
-      <w:tr>
-        <w:tc>
-          <w:tcPr>
-            <w:tcW w:w="9000" w:type="dxa"/>
-            <w:shd w:val="clear" w:color="auto" w:fill="EDEDED"/>
-          </w:tcPr>
-          <w:p>
-            <w:pPr>
-              <w:jc w:val="both"/>
-              <w:rPr>
-                <w:rFonts w:ascii="Times New Roman" w:hAnsi="Times New Roman" w:cs="Times New Roman"/>
-                <w:lang w:val="tr-TR"/>
-              </w:rPr>
-            </w:pPr>
-            <w:r>
-              <w:rPr>
-                <w:rFonts w:ascii="Times New Roman" w:hAnsi="Times New Roman" w:cs="Times New Roman"/>
-                <w:lang w:val="tr-TR"/>
-              </w:rPr>
-              <w:t xml:space="preserve">GÖRSEL ALANI (Shutterstock)</w:t>
-            </w:r>
-          </w:p>
-          <w:p>
-            <w:pPr>
-              <w:jc w:val="both"/>
-              <w:rPr>
-                <w:rFonts w:ascii="Times New Roman" w:hAnsi="Times New Roman" w:cs="Times New Roman"/>
-                <w:lang w:val="tr-TR"/>
-              </w:rPr>
-            </w:pPr>
-            <w:r>
-              <w:rPr>
-                <w:rFonts w:ascii="Times New Roman" w:hAnsi="Times New Roman" w:cs="Times New Roman"/>
-                <w:lang w:val="tr-TR"/>
-              </w:rPr>
-              <w:t xml:space="preserve">Tarif: Bir masa üzerinde akıllı telefon, dizüstü bilgisayar, kablosuz kulaklık ve bunların yanında silindirik lityum iyon pil hücreleri. Marka ve logo görünmesin.</w:t>
-            </w:r>
-          </w:p>
-          <w:p>
-            <w:pPr>
-              <w:jc w:val="both"/>
-              <w:rPr>
-                <w:rFonts w:ascii="Times New Roman" w:hAnsi="Times New Roman" w:cs="Times New Roman"/>
-                <w:lang w:val="tr-TR"/>
-              </w:rPr>
-            </w:pPr>
-            <w:r>
-              <w:rPr>
-                <w:rFonts w:ascii="Times New Roman" w:hAnsi="Times New Roman" w:cs="Times New Roman"/>
-                <w:lang w:val="tr-TR"/>
-              </w:rPr>
-              <w:t xml:space="preserve">Shutter ID: 2382373611 (fotoğraf) — Lithium batteries on white background</w:t>
-            </w:r>
-          </w:p>
-        </w:tc>
-      </w:tr>
-    </w:tbl>
+      </w:pPr>
+      <w:r>
+        <w:drawing>
+          <wp:inline xmlns:a="http://schemas.openxmlformats.org/drawingml/2006/main" xmlns:pic="http://schemas.openxmlformats.org/drawingml/2006/picture">
+            <wp:extent cx="4047109" cy="2520000"/>
+            <wp:docPr id="900012" name="Picture 900012"/>
+            <wp:cNvGraphicFramePr>
+              <a:graphicFrameLocks noChangeAspect="1"/>
+            </wp:cNvGraphicFramePr>
+            <a:graphic>
+              <a:graphicData uri="http://schemas.openxmlformats.org/drawingml/2006/picture">
+                <pic:pic>
+                  <pic:nvPicPr>
+                    <pic:cNvPr id="0" name="2382373611_d.jpg"/>
+                    <pic:cNvPicPr/>
+                  </pic:nvPicPr>
+                  <pic:blipFill>
+                    <a:blip r:embed="rId11"/>
+                    <a:stretch>
+                      <a:fillRect/>
+                    </a:stretch>
+                  </pic:blipFill>
+                  <pic:spPr>
+                    <a:xfrm>
+                      <a:off x="0" y="0"/>
+                      <a:ext cx="4047109" cy="2520000"/>
+                    </a:xfrm>
+                    <a:prstGeom prst="rect"/>
+                  </pic:spPr>
+                </pic:pic>
+              </a:graphicData>
+            </a:graphic>
+          </wp:inline>
+        </w:drawing>
+      </w:r>
+    </w:p>
     <w:p>
       <w:pPr>
-        <w:jc w:val="both"/>
-        <w:rPr>
-          <w:rFonts w:ascii="Times New Roman" w:hAnsi="Times New Roman" w:cs="Times New Roman"/>
-          <w:lang w:val="tr-TR"/>
-        </w:rPr>
-      </w:pPr>
+        <w:jc w:val="center"/>
+      </w:pPr>
+      <w:r>
+        <w:rPr>
+          <w:rFonts w:ascii="Times New Roman" w:hAnsi="Times New Roman" w:cs="Times New Roman"/>
+          <w:b/>
+          <w:bCs/>
+          <w:highlight w:val="yellow"/>
+          <w:lang w:val="tr-TR"/>
+        </w:rPr>
+        <w:t xml:space="preserve">Shutter id: 2382373611</w:t>
+      </w:r>
     </w:p>
     <w:p>
       <w:pPr>
@@ -9366,85 +9340,59 @@
         <w:t xml:space="preserve">Bir pilin gerilimi, içinde gerçekleşen redoks tepkimesinin anot ve katot yarı tepkimelerine bağlıdır. Kumanda ve oyuncaklarda kullanılan çinko-karbon ve alkalin pillerde anot çinkodur; bu piller yaklaşık 1,5 V gerilim üretir. Şarj edilebilir nikel-metal hidrür piller yaklaşık 1,2 V, otomobil akülerinde kullanılan kurşun-asit hücrelerinin her biri yaklaşık 2,0 V gerilim sağlar; 12 V’luk bir akü seri bağlanmış altı hücreden oluşur. Lityum iyon pillerin tek bir hücresi ise yaklaşık 3,6-3,7 V gerilim üretir (aşağıdaki görsel). Lityumun standart indirgenme potansiyelinin metaller arasında en düşük değerde (−3,04 V) olması ve lityumun çok hafif bir metal olması, bu pillerin küçük bir kütlede yüksek gerilim ve yüksek enerji sağlamasının temel nedenlerindendir.</w:t>
       </w:r>
     </w:p>
-    <w:tbl>
-      <w:tblPr>
-        <w:tblW w:w="9000" w:type="dxa"/>
+    <w:p>
+      <w:pPr>
         <w:jc w:val="center"/>
-        <w:tblBorders>
-          <w:top w:val="single" w:sz="8" w:space="0" w:color="7F7F7F"/>
-          <w:left w:val="single" w:sz="8" w:space="0" w:color="7F7F7F"/>
-          <w:bottom w:val="single" w:sz="8" w:space="0" w:color="7F7F7F"/>
-          <w:right w:val="single" w:sz="8" w:space="0" w:color="7F7F7F"/>
-        </w:tblBorders>
-      </w:tblPr>
-      <w:tblGrid>
-        <w:gridCol w:w="9000"/>
-      </w:tblGrid>
-      <w:tr>
-        <w:tc>
-          <w:tcPr>
-            <w:tcW w:w="9000" w:type="dxa"/>
-            <w:shd w:val="clear" w:color="auto" w:fill="EDEDED"/>
-          </w:tcPr>
-          <w:p>
-            <w:pPr>
-              <w:jc w:val="both"/>
-              <w:rPr>
-                <w:rFonts w:ascii="Times New Roman" w:hAnsi="Times New Roman" w:cs="Times New Roman"/>
-                <w:lang w:val="tr-TR"/>
-              </w:rPr>
-            </w:pPr>
-            <w:r>
-              <w:rPr>
-                <w:rFonts w:ascii="Times New Roman" w:hAnsi="Times New Roman" w:cs="Times New Roman"/>
-                <w:lang w:val="tr-TR"/>
-              </w:rPr>
-              <w:t xml:space="preserve">GÖRSEL ALANI (Shutterstock)</w:t>
-            </w:r>
-          </w:p>
-          <w:p>
-            <w:pPr>
-              <w:jc w:val="both"/>
-              <w:rPr>
-                <w:rFonts w:ascii="Times New Roman" w:hAnsi="Times New Roman" w:cs="Times New Roman"/>
-                <w:lang w:val="tr-TR"/>
-              </w:rPr>
-            </w:pPr>
-            <w:r>
-              <w:rPr>
-                <w:rFonts w:ascii="Times New Roman" w:hAnsi="Times New Roman" w:cs="Times New Roman"/>
-                <w:lang w:val="tr-TR"/>
-              </w:rPr>
-              <w:t xml:space="preserve">Tarif: Beyaz zemin üzerinde yan yana dizilmiş AA alkalin pil, düğme pil, şarj edilebilir pil, silindirik lityum iyon hücre ve küçük bir kurşun-asit akü. Marka ve logo görünmesin.</w:t>
-            </w:r>
-          </w:p>
-          <w:p>
-            <w:pPr>
-              <w:jc w:val="both"/>
-              <w:rPr>
-                <w:rFonts w:ascii="Times New Roman" w:hAnsi="Times New Roman" w:cs="Times New Roman"/>
-                <w:lang w:val="tr-TR"/>
-              </w:rPr>
-            </w:pPr>
-            <w:r>
-              <w:rPr>
-                <w:rFonts w:ascii="Times New Roman" w:hAnsi="Times New Roman" w:cs="Times New Roman"/>
-                <w:lang w:val="tr-TR"/>
-              </w:rPr>
-              <w:t xml:space="preserve">Shutter ID: 2138004859 (fotoğraf) — Different types of batteries (AA, AAA, D, 9V, button cell)</w:t>
-            </w:r>
-          </w:p>
-        </w:tc>
-      </w:tr>
-    </w:tbl>
+      </w:pPr>
+      <w:r>
+        <w:drawing>
+          <wp:inline xmlns:a="http://schemas.openxmlformats.org/drawingml/2006/main" xmlns:pic="http://schemas.openxmlformats.org/drawingml/2006/picture">
+            <wp:extent cx="3433242" cy="2520000"/>
+            <wp:docPr id="900013" name="Picture 900013"/>
+            <wp:cNvGraphicFramePr>
+              <a:graphicFrameLocks noChangeAspect="1"/>
+            </wp:cNvGraphicFramePr>
+            <a:graphic>
+              <a:graphicData uri="http://schemas.openxmlformats.org/drawingml/2006/picture">
+                <pic:pic>
+                  <pic:nvPicPr>
+                    <pic:cNvPr id="0" name="2138004859_d.jpg"/>
+                    <pic:cNvPicPr/>
+                  </pic:nvPicPr>
+                  <pic:blipFill>
+                    <a:blip r:embed="rId12"/>
+                    <a:stretch>
+                      <a:fillRect/>
+                    </a:stretch>
+                  </pic:blipFill>
+                  <pic:spPr>
+                    <a:xfrm>
+                      <a:off x="0" y="0"/>
+                      <a:ext cx="3433242" cy="2520000"/>
+                    </a:xfrm>
+                    <a:prstGeom prst="rect"/>
+                  </pic:spPr>
+                </pic:pic>
+              </a:graphicData>
+            </a:graphic>
+          </wp:inline>
+        </w:drawing>
+      </w:r>
+    </w:p>
     <w:p>
       <w:pPr>
-        <w:jc w:val="both"/>
-        <w:rPr>
-          <w:rFonts w:ascii="Times New Roman" w:hAnsi="Times New Roman" w:cs="Times New Roman"/>
-          <w:lang w:val="tr-TR"/>
-        </w:rPr>
-      </w:pPr>
+        <w:jc w:val="center"/>
+      </w:pPr>
+      <w:r>
+        <w:rPr>
+          <w:rFonts w:ascii="Times New Roman" w:hAnsi="Times New Roman" w:cs="Times New Roman"/>
+          <w:b/>
+          <w:bCs/>
+          <w:highlight w:val="yellow"/>
+          <w:lang w:val="tr-TR"/>
+        </w:rPr>
+        <w:t xml:space="preserve">Shutter id: 2138004859</w:t>
+      </w:r>
     </w:p>
     <w:p>
       <w:pPr>

</xml_diff>